<commit_message>
Prompty generatoru v2.1 (audit A0601, pravidla pro otazky), architekt v3.0: rozpory a limit hlaseni
Co-Authored-By: Claude Opus 5.5 <noreply@anthropic.com>
</commit_message>
<xml_diff>
--- a/MatriceVer7/PRAKTIK-AI_Prompt_Metodicky_architekt_v3.0.docx
+++ b/MatriceVer7/PRAKTIK-AI_Prompt_Metodicky_architekt_v3.0.docx
@@ -1931,16 +1931,11 @@
         </w:rPr>
         <w:t>Rozpory ve zdrojích:</w:t>
       </w:r>
-    </w:p>
-    <w:p>
-      <w:pPr>
-        <w:pStyle w:val="ListBullet2"/>
-      </w:pPr>
       <w:r>
         <w:rPr>
           <w:b w:val="0"/>
         </w:rPr>
-        <w:t>Nerozhoduj za autora. Zapiš rozpor do 14_Zdroje (Známé rozpory) a do hlášení.</w:t>
+        <w:t xml:space="preserve"> nerozhoduj za autora a zapiš rozpor do 14_Zdroje (Známé rozpory). Rozlišuj dva typy:</w:t>
       </w:r>
     </w:p>
     <w:p>
@@ -1949,9 +1944,15 @@
       </w:pPr>
       <w:r>
         <w:rPr>
+          <w:b/>
+        </w:rPr>
+        <w:t>nesoulad pravidel</w:t>
+      </w:r>
+      <w:r>
+        <w:rPr>
           <w:b w:val="0"/>
         </w:rPr>
-        <w:t>Do textu pro účastníka dej znění podle nejzávaznějšího zdroje (předpis &gt; metodika &gt; ostatní) s odkazem na plné znění.</w:t>
+        <w:t xml:space="preserve"> (předpisy, metodiky, interní dokumenty): do textu pro účastníka dej znění podle nejzávaznějšího zdroje (předpis &gt; metodika &gt; ostatní) s odkazem na plné znění; pokud to pomůže porozumění, využij rozpor k objasnění problému; vždy ho nahlas.</w:t>
       </w:r>
     </w:p>
     <w:p>
@@ -1960,9 +1961,15 @@
       </w:pPr>
       <w:r>
         <w:rPr>
+          <w:b/>
+        </w:rPr>
+        <w:t>vědecký spor</w:t>
+      </w:r>
+      <w:r>
+        <w:rPr>
           <w:b w:val="0"/>
         </w:rPr>
-        <w:t>Pokud to pomůže porozumění, využij rozpor k objasnění problému.</w:t>
+        <w:t xml:space="preserve"> (dvě výzkumná zjištění): vylož obě se silou důkazu; u vyšších úrovní jako otevřenou otázku oboru. Hlas ho jen tehdy, když chybí zdroj nebo síla důkazu.</w:t>
       </w:r>
     </w:p>
     <w:p>
@@ -2410,7 +2417,7 @@
         <w:rPr>
           <w:b w:val="0"/>
         </w:rPr>
-        <w:t>Hlášení je pro metodika, ne pro účastníka. Piš ho věcně. Metodik ho vyřeší a z textu odstraní; kurz s otevřeným hlášením neprojde automatickou kontrolou v listu 13_Validace.</w:t>
+        <w:t>Nejvýše 3 hlášení na modul, nejzávažnější první; problémy stejného druhu spoj do jednoho. Problém, který se týká více modulů, hlas jen v modulu, kde se látka vykládá. Stav metadat (kód čeká na potvrzení) nehlas. „Zdroj nestačí na rozsah F1" hlas, až když F1 vyjde pod 75 % dolní meze z oddílu 5. Hlášení je pro metodika, ne pro účastníka. Piš ho věcně. Metodik ho vyřeší a z textu odstraní; kurz s otevřeným hlášením neprojde automatickou kontrolou v listu 13_Validace.</w:t>
       </w:r>
     </w:p>
     <w:p>

</xml_diff>